<commit_message>
Improve vocabulary app responsiveness and layout
</commit_message>
<xml_diff>
--- a/plans/6th Grade Technology/Rubrics/6th grade - IIIT - Week 1 - Rubric for Summative 1.docx
+++ b/plans/6th Grade Technology/Rubrics/6th grade - IIIT - Week 1 - Rubric for Summative 1.docx
@@ -5,7 +5,7 @@
     <w:tbl>
       <w:tblPr>
         <w:tblpPr w:leftFromText="180" w:rightFromText="180" w:vertAnchor="text" w:horzAnchor="page" w:tblpXSpec="center" w:tblpY="-626"/>
-        <w:tblW w:w="11377" w:type="dxa"/>
+        <w:tblW w:w="11343" w:type="dxa"/>
         <w:jc w:val="center"/>
         <w:tblBorders>
           <w:top w:val="single" w:sz="8" w:space="0" w:color="000000"/>
@@ -19,11 +19,12 @@
         <w:tblLook w:val="0600" w:firstRow="0" w:lastRow="0" w:firstColumn="0" w:lastColumn="0" w:noHBand="1" w:noVBand="1"/>
       </w:tblPr>
       <w:tblGrid>
-        <w:gridCol w:w="1516"/>
-        <w:gridCol w:w="2888"/>
-        <w:gridCol w:w="1949"/>
-        <w:gridCol w:w="1949"/>
-        <w:gridCol w:w="3075"/>
+        <w:gridCol w:w="1550"/>
+        <w:gridCol w:w="2583"/>
+        <w:gridCol w:w="2236"/>
+        <w:gridCol w:w="2268"/>
+        <w:gridCol w:w="2693"/>
+        <w:gridCol w:w="13"/>
       </w:tblGrid>
       <w:tr>
         <w:trPr>
@@ -32,154 +33,338 @@
         </w:trPr>
         <w:tc>
           <w:tcPr>
-            <w:tcW w:w="11377" w:type="dxa"/>
-            <w:gridSpan w:val="5"/>
-            <w:tcMar>
-              <w:top w:w="100" w:type="dxa"/>
-              <w:left w:w="100" w:type="dxa"/>
-              <w:bottom w:w="100" w:type="dxa"/>
-              <w:right w:w="100" w:type="dxa"/>
-            </w:tcMar>
-            <w:vAlign w:val="center"/>
-          </w:tcPr>
-          <w:p>
-            <w:pPr>
-              <w:spacing w:line="240" w:lineRule="auto"/>
+            <w:tcW w:w="11343" w:type="dxa"/>
+            <w:gridSpan w:val="6"/>
+            <w:tcMar>
+              <w:top w:w="100" w:type="dxa"/>
+              <w:left w:w="100" w:type="dxa"/>
+              <w:bottom w:w="100" w:type="dxa"/>
+              <w:right w:w="100" w:type="dxa"/>
+            </w:tcMar>
+          </w:tcPr>
+          <w:p>
+            <w:pPr>
+              <w:widowControl w:val="0"/>
+              <w:pBdr>
+                <w:top w:val="nil"/>
+                <w:left w:val="nil"/>
+                <w:bottom w:val="nil"/>
+                <w:right w:val="nil"/>
+                <w:between w:val="nil"/>
+              </w:pBdr>
               <w:jc w:val="center"/>
-            </w:pPr>
-            <w:r>
-              <w:rPr>
-                <w:b/>
-                <w:bCs/>
+              <w:rPr>
+                <w:b/>
+                <w:bCs/>
+                <w:color w:val="000000"/>
+              </w:rPr>
+            </w:pPr>
+            <w:r>
+              <w:rPr>
+                <w:b/>
+                <w:noProof/>
+                <w:sz w:val="24"/>
+                <w:szCs w:val="24"/>
+              </w:rPr>
+              <w:drawing>
+                <wp:anchor distT="0" distB="0" distL="114300" distR="114300" simplePos="0" relativeHeight="251658240" behindDoc="0" locked="0" layoutInCell="1" allowOverlap="1">
+                  <wp:simplePos x="0" y="0"/>
+                  <wp:positionH relativeFrom="column">
+                    <wp:posOffset>90805</wp:posOffset>
+                  </wp:positionH>
+                  <wp:positionV relativeFrom="paragraph">
+                    <wp:posOffset>-10893</wp:posOffset>
+                  </wp:positionV>
+                  <wp:extent cx="464233" cy="595860"/>
+                  <wp:effectExtent l="0" t="0" r="5715" b="1270"/>
+                  <wp:wrapNone/>
+                  <wp:docPr id="2095330268" name="Picture 1" descr="Grupo Academia Internacional"/>
+                  <wp:cNvGraphicFramePr>
+                    <a:graphicFrameLocks xmlns:a="http://schemas.openxmlformats.org/drawingml/2006/main" noChangeAspect="1"/>
+                  </wp:cNvGraphicFramePr>
+                  <a:graphic xmlns:a="http://schemas.openxmlformats.org/drawingml/2006/main">
+                    <a:graphicData uri="http://schemas.openxmlformats.org/drawingml/2006/picture">
+                      <pic:pic xmlns:pic="http://schemas.openxmlformats.org/drawingml/2006/picture">
+                        <pic:nvPicPr>
+                          <pic:cNvPr id="0" name="Picture 1" descr="Grupo Academia Internacional"/>
+                          <pic:cNvPicPr>
+                            <a:picLocks noChangeAspect="1" noChangeArrowheads="1"/>
+                          </pic:cNvPicPr>
+                        </pic:nvPicPr>
+                        <pic:blipFill>
+                          <a:blip r:embed="rId7" cstate="print">
+                            <a:extLst>
+                              <a:ext uri="{28A0092B-C50C-407E-A947-70E740481C1C}">
+                                <a14:useLocalDpi xmlns:a14="http://schemas.microsoft.com/office/drawing/2010/main" val="0"/>
+                              </a:ext>
+                            </a:extLst>
+                          </a:blip>
+                          <a:srcRect/>
+                          <a:stretch>
+                            <a:fillRect/>
+                          </a:stretch>
+                        </pic:blipFill>
+                        <pic:spPr bwMode="auto">
+                          <a:xfrm>
+                            <a:off x="0" y="0"/>
+                            <a:ext cx="464233" cy="595860"/>
+                          </a:xfrm>
+                          <a:prstGeom prst="rect">
+                            <a:avLst/>
+                          </a:prstGeom>
+                          <a:noFill/>
+                          <a:ln>
+                            <a:noFill/>
+                          </a:ln>
+                        </pic:spPr>
+                      </pic:pic>
+                    </a:graphicData>
+                  </a:graphic>
+                  <wp14:sizeRelH relativeFrom="page">
+                    <wp14:pctWidth>0</wp14:pctWidth>
+                  </wp14:sizeRelH>
+                  <wp14:sizeRelV relativeFrom="page">
+                    <wp14:pctHeight>0</wp14:pctHeight>
+                  </wp14:sizeRelV>
+                </wp:anchor>
+              </w:drawing>
+            </w:r>
+            <w:r>
+              <w:rPr>
+                <w:b/>
+                <w:bCs/>
+                <w:color w:val="000000"/>
+                <w:sz w:val="24"/>
+                <w:szCs w:val="24"/>
               </w:rPr>
               <w:t>Academia Internacional David</w:t>
             </w:r>
-            <w:r>
-              <w:rPr>
-                <w:b/>
-                <w:bCs/>
-              </w:rPr>
-              <w:br/>
+          </w:p>
+          <w:p>
+            <w:pPr>
+              <w:widowControl w:val="0"/>
+              <w:pBdr>
+                <w:top w:val="nil"/>
+                <w:left w:val="nil"/>
+                <w:bottom w:val="nil"/>
+                <w:right w:val="nil"/>
+                <w:between w:val="nil"/>
+              </w:pBdr>
+              <w:jc w:val="center"/>
+              <w:rPr>
+                <w:b/>
+                <w:bCs/>
+                <w:color w:val="000000"/>
+              </w:rPr>
+            </w:pPr>
+            <w:r>
+              <w:rPr>
+                <w:b/>
+                <w:sz w:val="24"/>
+                <w:szCs w:val="24"/>
+              </w:rPr>
+              <w:fldChar w:fldCharType="begin"/>
+            </w:r>
+            <w:r>
+              <w:rPr>
+                <w:b/>
+                <w:sz w:val="24"/>
+                <w:szCs w:val="24"/>
+              </w:rPr>
+              <w:instrText xml:space="preserve"> INCLUDEPICTURE "https://images.squarespace-cdn.com/content/v1/5ef20e361b5c38645824cf2d/1ba41312-71c9-4bc6-b298-40d1a914a4ad/logo+_grupo_+academia+int.png.jpg" \* MERGEFORMATINET </w:instrText>
+            </w:r>
+            <w:r>
+              <w:rPr>
+                <w:b/>
+                <w:sz w:val="24"/>
+                <w:szCs w:val="24"/>
+              </w:rPr>
+              <w:fldChar w:fldCharType="separate"/>
+            </w:r>
+            <w:r>
+              <w:rPr>
+                <w:b/>
+                <w:sz w:val="24"/>
+                <w:szCs w:val="24"/>
+              </w:rPr>
+              <w:fldChar w:fldCharType="end"/>
+            </w:r>
+            <w:r>
+              <w:rPr>
+                <w:b/>
+                <w:bCs/>
+                <w:color w:val="000000"/>
+                <w:sz w:val="24"/>
+                <w:szCs w:val="24"/>
+              </w:rPr>
               <w:t>Robotics and Technology</w:t>
             </w:r>
-            <w:r>
-              <w:rPr>
-                <w:b/>
-                <w:bCs/>
-              </w:rPr>
-              <w:br/>
+          </w:p>
+          <w:p>
+            <w:pPr>
+              <w:widowControl w:val="0"/>
+              <w:pBdr>
+                <w:top w:val="nil"/>
+                <w:left w:val="nil"/>
+                <w:bottom w:val="nil"/>
+                <w:right w:val="nil"/>
+                <w:between w:val="nil"/>
+              </w:pBdr>
+              <w:jc w:val="center"/>
+              <w:rPr>
+                <w:b/>
+                <w:bCs/>
+                <w:color w:val="000000"/>
+              </w:rPr>
+            </w:pPr>
+            <w:r>
+              <w:rPr>
+                <w:b/>
+                <w:bCs/>
+                <w:color w:val="000000"/>
+                <w:sz w:val="24"/>
+                <w:szCs w:val="24"/>
+              </w:rPr>
               <w:t>3rd Trimester</w:t>
             </w:r>
-            <w:r>
-              <w:rPr>
-                <w:b/>
-                <w:bCs/>
-              </w:rPr>
-              <w:br/>
+          </w:p>
+          <w:p>
+            <w:pPr>
+              <w:widowControl w:val="0"/>
+              <w:pBdr>
+                <w:top w:val="nil"/>
+                <w:left w:val="nil"/>
+                <w:bottom w:val="nil"/>
+                <w:right w:val="nil"/>
+                <w:between w:val="nil"/>
+              </w:pBdr>
+              <w:jc w:val="center"/>
+              <w:rPr>
+                <w:b/>
+                <w:bCs/>
+                <w:color w:val="000000"/>
+              </w:rPr>
+            </w:pPr>
+            <w:r>
+              <w:rPr>
+                <w:b/>
+                <w:bCs/>
+                <w:color w:val="000000"/>
+                <w:sz w:val="24"/>
+                <w:szCs w:val="24"/>
+              </w:rPr>
               <w:t>Summative #1</w:t>
             </w:r>
-            <w:r>
-              <w:rPr>
-                <w:b/>
-                <w:bCs/>
-              </w:rPr>
-              <w:br/>
-              <w:t>6th A &amp; B</w:t>
-            </w:r>
-            <w:r>
-              <w:rPr>
-                <w:b/>
-                <w:bCs/>
-              </w:rPr>
-              <w:t xml:space="preserve"> </w:t>
-            </w:r>
-            <w:r>
-              <w:rPr>
-                <w:b/>
-                <w:bCs/>
-              </w:rPr>
-              <w:t xml:space="preserve">&amp; </w:t>
-            </w:r>
-            <w:r>
-              <w:rPr>
-                <w:b/>
-                <w:bCs/>
-              </w:rPr>
-              <w:t>C</w:t>
-            </w:r>
-            <w:r>
-              <w:br/>
-            </w:r>
-            <w:r>
-              <w:rPr>
-                <w:b/>
-                <w:bCs/>
-              </w:rPr>
-              <w:t>Name</w:t>
-            </w:r>
-            <w:r>
-              <w:t xml:space="preserve">: ________________________________   </w:t>
-            </w:r>
-            <w:r>
-              <w:rPr>
-                <w:b/>
-                <w:bCs/>
-              </w:rPr>
-              <w:t>Date</w:t>
-            </w:r>
-            <w:r>
-              <w:t xml:space="preserve">: __________________   </w:t>
-            </w:r>
-            <w:r>
-              <w:rPr>
-                <w:b/>
-                <w:bCs/>
-              </w:rPr>
-              <w:t>Group</w:t>
-            </w:r>
-            <w:r>
-              <w:t>: 6° A B</w:t>
-            </w:r>
-            <w:r>
-              <w:t xml:space="preserve"> C</w:t>
-            </w:r>
-            <w:r>
-              <w:br/>
-            </w:r>
-            <w:r>
-              <w:rPr>
-                <w:b/>
-                <w:bCs/>
-              </w:rPr>
-              <w:t xml:space="preserve">Teacher: </w:t>
-            </w:r>
-            <w:r>
-              <w:t>Porfirio Rios</w:t>
-            </w:r>
-            <w:r>
-              <w:rPr>
-                <w:b/>
-                <w:bCs/>
-              </w:rPr>
-              <w:t xml:space="preserve">                  Score</w:t>
-            </w:r>
-            <w:r>
-              <w:t xml:space="preserve">: _____ / </w:t>
-            </w:r>
-            <w:r>
-              <w:rPr>
-                <w:b/>
-                <w:bCs/>
-              </w:rPr>
-              <w:t>40pts</w:t>
-            </w:r>
-            <w:r>
-              <w:br/>
-            </w:r>
-            <w:r>
-              <w:rPr>
-                <w:b/>
-                <w:bCs/>
+          </w:p>
+          <w:p>
+            <w:pPr>
+              <w:widowControl w:val="0"/>
+              <w:pBdr>
+                <w:top w:val="nil"/>
+                <w:left w:val="nil"/>
+                <w:bottom w:val="nil"/>
+                <w:right w:val="nil"/>
+                <w:between w:val="nil"/>
+              </w:pBdr>
+              <w:jc w:val="center"/>
+              <w:rPr>
+                <w:b/>
+                <w:bCs/>
+                <w:color w:val="000000"/>
+              </w:rPr>
+            </w:pPr>
+            <w:r>
+              <w:rPr>
+                <w:b/>
+                <w:bCs/>
+                <w:color w:val="000000"/>
+                <w:sz w:val="24"/>
+                <w:szCs w:val="24"/>
+              </w:rPr>
+              <w:t>6th A &amp; B &amp; C</w:t>
+            </w:r>
+          </w:p>
+          <w:p>
+            <w:pPr>
+              <w:widowControl w:val="0"/>
+              <w:pBdr>
+                <w:top w:val="nil"/>
+                <w:left w:val="nil"/>
+                <w:bottom w:val="nil"/>
+                <w:right w:val="nil"/>
+                <w:between w:val="nil"/>
+              </w:pBdr>
+              <w:ind w:left="132" w:right="341"/>
+              <w:rPr>
+                <w:b/>
+                <w:bCs/>
+                <w:color w:val="000000"/>
+              </w:rPr>
+            </w:pPr>
+            <w:r>
+              <w:rPr>
+                <w:b/>
+                <w:bCs/>
+                <w:color w:val="000000"/>
+                <w:sz w:val="24"/>
+                <w:szCs w:val="24"/>
+              </w:rPr>
+              <w:t>Name: ________________________________   Date: __________________   Group: 6° A B C</w:t>
+            </w:r>
+          </w:p>
+          <w:p>
+            <w:pPr>
+              <w:widowControl w:val="0"/>
+              <w:pBdr>
+                <w:top w:val="nil"/>
+                <w:left w:val="nil"/>
+                <w:bottom w:val="nil"/>
+                <w:right w:val="nil"/>
+                <w:between w:val="nil"/>
+              </w:pBdr>
+              <w:ind w:left="132" w:right="341"/>
+              <w:rPr>
+                <w:b/>
+                <w:bCs/>
+                <w:color w:val="000000"/>
+              </w:rPr>
+            </w:pPr>
+            <w:r>
+              <w:rPr>
+                <w:b/>
+                <w:bCs/>
+                <w:color w:val="000000"/>
+                <w:sz w:val="24"/>
+                <w:szCs w:val="24"/>
+              </w:rPr>
+              <w:t>Teacher: Porfirio Rios                  Score: _____ / 40pts</w:t>
+            </w:r>
+          </w:p>
+          <w:p>
+            <w:pPr>
+              <w:widowControl w:val="0"/>
+              <w:pBdr>
+                <w:top w:val="nil"/>
+                <w:left w:val="nil"/>
+                <w:bottom w:val="nil"/>
+                <w:right w:val="nil"/>
+                <w:between w:val="nil"/>
+              </w:pBdr>
+              <w:ind w:left="132" w:right="341"/>
+              <w:jc w:val="center"/>
+              <w:rPr>
+                <w:b/>
+                <w:bCs/>
+                <w:color w:val="000000"/>
+              </w:rPr>
+            </w:pPr>
+            <w:r>
+              <w:rPr>
+                <w:b/>
+                <w:bCs/>
+                <w:color w:val="000000"/>
+                <w:sz w:val="24"/>
+                <w:szCs w:val="24"/>
               </w:rPr>
               <w:t>Spreadsheet Word Hunt Vocabulary Report</w:t>
             </w:r>
@@ -188,32 +373,36 @@
       </w:tr>
       <w:tr>
         <w:trPr>
+          <w:gridAfter w:val="1"/>
+          <w:wAfter w:w="13" w:type="dxa"/>
           <w:trHeight w:val="191"/>
           <w:jc w:val="center"/>
         </w:trPr>
         <w:tc>
           <w:tcPr>
-            <w:tcW w:w="1516" w:type="dxa"/>
-            <w:tcMar>
-              <w:top w:w="100" w:type="dxa"/>
-              <w:left w:w="100" w:type="dxa"/>
-              <w:bottom w:w="100" w:type="dxa"/>
-              <w:right w:w="100" w:type="dxa"/>
-            </w:tcMar>
-            <w:vAlign w:val="center"/>
-          </w:tcPr>
-          <w:p>
-            <w:pPr>
-              <w:spacing w:line="240" w:lineRule="auto"/>
-              <w:rPr>
-                <w:b/>
-                <w:bCs/>
-              </w:rPr>
-            </w:pPr>
-            <w:r>
-              <w:rPr>
-                <w:b/>
-                <w:bCs/>
+            <w:tcW w:w="1550" w:type="dxa"/>
+            <w:tcMar>
+              <w:top w:w="100" w:type="dxa"/>
+              <w:left w:w="100" w:type="dxa"/>
+              <w:bottom w:w="100" w:type="dxa"/>
+              <w:right w:w="100" w:type="dxa"/>
+            </w:tcMar>
+            <w:vAlign w:val="center"/>
+          </w:tcPr>
+          <w:p>
+            <w:pPr>
+              <w:spacing w:line="240" w:lineRule="auto"/>
+              <w:rPr>
+                <w:b/>
+                <w:bCs/>
+              </w:rPr>
+            </w:pPr>
+            <w:r>
+              <w:rPr>
+                <w:b/>
+                <w:bCs/>
+                <w:sz w:val="24"/>
+                <w:szCs w:val="24"/>
               </w:rPr>
               <w:t>Criteria</w:t>
             </w:r>
@@ -221,80 +410,100 @@
         </w:tc>
         <w:tc>
           <w:tcPr>
-            <w:tcW w:w="2888" w:type="dxa"/>
-            <w:tcMar>
-              <w:top w:w="100" w:type="dxa"/>
-              <w:left w:w="100" w:type="dxa"/>
-              <w:bottom w:w="100" w:type="dxa"/>
-              <w:right w:w="100" w:type="dxa"/>
-            </w:tcMar>
-            <w:vAlign w:val="center"/>
-          </w:tcPr>
-          <w:p>
-            <w:pPr>
-              <w:spacing w:line="240" w:lineRule="auto"/>
-            </w:pPr>
-            <w:r>
+            <w:tcW w:w="2583" w:type="dxa"/>
+            <w:tcMar>
+              <w:top w:w="100" w:type="dxa"/>
+              <w:left w:w="100" w:type="dxa"/>
+              <w:bottom w:w="100" w:type="dxa"/>
+              <w:right w:w="100" w:type="dxa"/>
+            </w:tcMar>
+            <w:vAlign w:val="center"/>
+          </w:tcPr>
+          <w:p>
+            <w:pPr>
+              <w:spacing w:line="240" w:lineRule="auto"/>
+            </w:pPr>
+            <w:r>
+              <w:rPr>
+                <w:b/>
+                <w:sz w:val="24"/>
+                <w:szCs w:val="24"/>
+              </w:rPr>
               <w:t>9</w:t>
             </w:r>
           </w:p>
         </w:tc>
         <w:tc>
           <w:tcPr>
-            <w:tcW w:w="1949" w:type="dxa"/>
-            <w:tcMar>
-              <w:top w:w="100" w:type="dxa"/>
-              <w:left w:w="100" w:type="dxa"/>
-              <w:bottom w:w="100" w:type="dxa"/>
-              <w:right w:w="100" w:type="dxa"/>
-            </w:tcMar>
-            <w:vAlign w:val="center"/>
-          </w:tcPr>
-          <w:p>
-            <w:pPr>
-              <w:spacing w:line="240" w:lineRule="auto"/>
-            </w:pPr>
-            <w:r>
+            <w:tcW w:w="2236" w:type="dxa"/>
+            <w:tcMar>
+              <w:top w:w="100" w:type="dxa"/>
+              <w:left w:w="100" w:type="dxa"/>
+              <w:bottom w:w="100" w:type="dxa"/>
+              <w:right w:w="100" w:type="dxa"/>
+            </w:tcMar>
+            <w:vAlign w:val="center"/>
+          </w:tcPr>
+          <w:p>
+            <w:pPr>
+              <w:spacing w:line="240" w:lineRule="auto"/>
+            </w:pPr>
+            <w:r>
+              <w:rPr>
+                <w:b/>
+                <w:sz w:val="24"/>
+                <w:szCs w:val="24"/>
+              </w:rPr>
               <w:t>7</w:t>
             </w:r>
           </w:p>
         </w:tc>
         <w:tc>
           <w:tcPr>
-            <w:tcW w:w="1949" w:type="dxa"/>
-            <w:tcMar>
-              <w:top w:w="100" w:type="dxa"/>
-              <w:left w:w="100" w:type="dxa"/>
-              <w:bottom w:w="100" w:type="dxa"/>
-              <w:right w:w="100" w:type="dxa"/>
-            </w:tcMar>
-            <w:vAlign w:val="center"/>
-          </w:tcPr>
-          <w:p>
-            <w:pPr>
-              <w:spacing w:line="240" w:lineRule="auto"/>
-            </w:pPr>
-            <w:r>
+            <w:tcW w:w="2268" w:type="dxa"/>
+            <w:tcMar>
+              <w:top w:w="100" w:type="dxa"/>
+              <w:left w:w="100" w:type="dxa"/>
+              <w:bottom w:w="100" w:type="dxa"/>
+              <w:right w:w="100" w:type="dxa"/>
+            </w:tcMar>
+            <w:vAlign w:val="center"/>
+          </w:tcPr>
+          <w:p>
+            <w:pPr>
+              <w:spacing w:line="240" w:lineRule="auto"/>
+            </w:pPr>
+            <w:r>
+              <w:rPr>
+                <w:b/>
+                <w:sz w:val="24"/>
+                <w:szCs w:val="24"/>
+              </w:rPr>
               <w:t>5</w:t>
             </w:r>
           </w:p>
         </w:tc>
         <w:tc>
           <w:tcPr>
-            <w:tcW w:w="3072" w:type="dxa"/>
-            <w:tcMar>
-              <w:top w:w="100" w:type="dxa"/>
-              <w:left w:w="100" w:type="dxa"/>
-              <w:bottom w:w="100" w:type="dxa"/>
-              <w:right w:w="100" w:type="dxa"/>
-            </w:tcMar>
-            <w:vAlign w:val="center"/>
-          </w:tcPr>
-          <w:p>
-            <w:pPr>
-              <w:spacing w:line="240" w:lineRule="auto"/>
-            </w:pPr>
-            <w:r>
+            <w:tcW w:w="2693" w:type="dxa"/>
+            <w:tcMar>
+              <w:top w:w="100" w:type="dxa"/>
+              <w:left w:w="100" w:type="dxa"/>
+              <w:bottom w:w="100" w:type="dxa"/>
+              <w:right w:w="100" w:type="dxa"/>
+            </w:tcMar>
+            <w:vAlign w:val="center"/>
+          </w:tcPr>
+          <w:p>
+            <w:pPr>
+              <w:spacing w:line="240" w:lineRule="auto"/>
+            </w:pPr>
+            <w:r>
+              <w:rPr>
+                <w:b/>
+                <w:sz w:val="24"/>
+                <w:szCs w:val="24"/>
+              </w:rPr>
               <w:t>2</w:t>
             </w:r>
           </w:p>
@@ -302,32 +511,36 @@
       </w:tr>
       <w:tr>
         <w:trPr>
+          <w:gridAfter w:val="1"/>
+          <w:wAfter w:w="13" w:type="dxa"/>
           <w:trHeight w:val="1466"/>
           <w:jc w:val="center"/>
         </w:trPr>
         <w:tc>
           <w:tcPr>
-            <w:tcW w:w="1516" w:type="dxa"/>
-            <w:tcMar>
-              <w:top w:w="100" w:type="dxa"/>
-              <w:left w:w="100" w:type="dxa"/>
-              <w:bottom w:w="100" w:type="dxa"/>
-              <w:right w:w="100" w:type="dxa"/>
-            </w:tcMar>
-            <w:vAlign w:val="center"/>
-          </w:tcPr>
-          <w:p>
-            <w:pPr>
-              <w:spacing w:line="240" w:lineRule="auto"/>
-              <w:rPr>
-                <w:b/>
-                <w:bCs/>
-              </w:rPr>
-            </w:pPr>
-            <w:r>
-              <w:rPr>
-                <w:b/>
-                <w:bCs/>
+            <w:tcW w:w="1550" w:type="dxa"/>
+            <w:tcMar>
+              <w:top w:w="100" w:type="dxa"/>
+              <w:left w:w="100" w:type="dxa"/>
+              <w:bottom w:w="100" w:type="dxa"/>
+              <w:right w:w="100" w:type="dxa"/>
+            </w:tcMar>
+            <w:vAlign w:val="center"/>
+          </w:tcPr>
+          <w:p>
+            <w:pPr>
+              <w:spacing w:line="240" w:lineRule="auto"/>
+              <w:rPr>
+                <w:b/>
+                <w:bCs/>
+              </w:rPr>
+            </w:pPr>
+            <w:r>
+              <w:rPr>
+                <w:b/>
+                <w:bCs/>
+                <w:sz w:val="24"/>
+                <w:szCs w:val="24"/>
               </w:rPr>
               <w:t>Word Hunt completion</w:t>
             </w:r>
@@ -335,7 +548,7 @@
         </w:tc>
         <w:tc>
           <w:tcPr>
-            <w:tcW w:w="2888" w:type="dxa"/>
+            <w:tcW w:w="2583" w:type="dxa"/>
             <w:tcMar>
               <w:top w:w="100" w:type="dxa"/>
               <w:left w:w="100" w:type="dxa"/>
@@ -350,13 +563,17 @@
               <w:jc w:val="both"/>
             </w:pPr>
             <w:r>
+              <w:rPr>
+                <w:sz w:val="24"/>
+                <w:szCs w:val="24"/>
+              </w:rPr>
               <w:t>Completes all 10 assigned app Word Hunt entries.</w:t>
             </w:r>
           </w:p>
         </w:tc>
         <w:tc>
           <w:tcPr>
-            <w:tcW w:w="1949" w:type="dxa"/>
+            <w:tcW w:w="2236" w:type="dxa"/>
             <w:tcMar>
               <w:top w:w="100" w:type="dxa"/>
               <w:left w:w="100" w:type="dxa"/>
@@ -371,13 +588,17 @@
               <w:jc w:val="both"/>
             </w:pPr>
             <w:r>
+              <w:rPr>
+                <w:sz w:val="24"/>
+                <w:szCs w:val="24"/>
+              </w:rPr>
               <w:t>Completes 8-9 assigned Word Hunt entries.</w:t>
             </w:r>
           </w:p>
         </w:tc>
         <w:tc>
           <w:tcPr>
-            <w:tcW w:w="1949" w:type="dxa"/>
+            <w:tcW w:w="2268" w:type="dxa"/>
             <w:tcMar>
               <w:top w:w="100" w:type="dxa"/>
               <w:left w:w="100" w:type="dxa"/>
@@ -392,13 +613,17 @@
               <w:jc w:val="both"/>
             </w:pPr>
             <w:r>
+              <w:rPr>
+                <w:sz w:val="24"/>
+                <w:szCs w:val="24"/>
+              </w:rPr>
               <w:t>Completes 5-7 assigned Word Hunt entries.</w:t>
             </w:r>
           </w:p>
         </w:tc>
         <w:tc>
           <w:tcPr>
-            <w:tcW w:w="3072" w:type="dxa"/>
+            <w:tcW w:w="2693" w:type="dxa"/>
             <w:tcMar>
               <w:top w:w="100" w:type="dxa"/>
               <w:left w:w="100" w:type="dxa"/>
@@ -413,6 +638,10 @@
               <w:jc w:val="both"/>
             </w:pPr>
             <w:r>
+              <w:rPr>
+                <w:sz w:val="24"/>
+                <w:szCs w:val="24"/>
+              </w:rPr>
               <w:t>Completes 1-4 entries, or most entries are missing.</w:t>
             </w:r>
           </w:p>
@@ -420,32 +649,36 @@
       </w:tr>
       <w:tr>
         <w:trPr>
+          <w:gridAfter w:val="1"/>
+          <w:wAfter w:w="13" w:type="dxa"/>
           <w:trHeight w:val="1506"/>
           <w:jc w:val="center"/>
         </w:trPr>
         <w:tc>
           <w:tcPr>
-            <w:tcW w:w="1516" w:type="dxa"/>
-            <w:tcMar>
-              <w:top w:w="100" w:type="dxa"/>
-              <w:left w:w="100" w:type="dxa"/>
-              <w:bottom w:w="100" w:type="dxa"/>
-              <w:right w:w="100" w:type="dxa"/>
-            </w:tcMar>
-            <w:vAlign w:val="center"/>
-          </w:tcPr>
-          <w:p>
-            <w:pPr>
-              <w:spacing w:line="240" w:lineRule="auto"/>
-              <w:rPr>
-                <w:b/>
-                <w:bCs/>
-              </w:rPr>
-            </w:pPr>
-            <w:r>
-              <w:rPr>
-                <w:b/>
-                <w:bCs/>
+            <w:tcW w:w="1550" w:type="dxa"/>
+            <w:tcMar>
+              <w:top w:w="100" w:type="dxa"/>
+              <w:left w:w="100" w:type="dxa"/>
+              <w:bottom w:w="100" w:type="dxa"/>
+              <w:right w:w="100" w:type="dxa"/>
+            </w:tcMar>
+            <w:vAlign w:val="center"/>
+          </w:tcPr>
+          <w:p>
+            <w:pPr>
+              <w:spacing w:line="240" w:lineRule="auto"/>
+              <w:rPr>
+                <w:b/>
+                <w:bCs/>
+              </w:rPr>
+            </w:pPr>
+            <w:r>
+              <w:rPr>
+                <w:b/>
+                <w:bCs/>
+                <w:sz w:val="24"/>
+                <w:szCs w:val="24"/>
               </w:rPr>
               <w:t>Definitions</w:t>
             </w:r>
@@ -453,7 +686,7 @@
         </w:tc>
         <w:tc>
           <w:tcPr>
-            <w:tcW w:w="2888" w:type="dxa"/>
+            <w:tcW w:w="2583" w:type="dxa"/>
             <w:tcMar>
               <w:top w:w="100" w:type="dxa"/>
               <w:left w:w="100" w:type="dxa"/>
@@ -468,13 +701,17 @@
               <w:jc w:val="both"/>
             </w:pPr>
             <w:r>
-              <w:t>Definitions are accurate, student-friendly, and clearly match the word, even when an internet definition is used.</w:t>
-            </w:r>
-          </w:p>
-        </w:tc>
-        <w:tc>
-          <w:tcPr>
-            <w:tcW w:w="1949" w:type="dxa"/>
+              <w:rPr>
+                <w:sz w:val="24"/>
+                <w:szCs w:val="24"/>
+              </w:rPr>
+              <w:t>Definitions are accurate, student-friendly, and clearly explain each word in the student's own words.</w:t>
+            </w:r>
+          </w:p>
+        </w:tc>
+        <w:tc>
+          <w:tcPr>
+            <w:tcW w:w="2236" w:type="dxa"/>
             <w:tcMar>
               <w:top w:w="100" w:type="dxa"/>
               <w:left w:w="100" w:type="dxa"/>
@@ -489,13 +726,17 @@
               <w:jc w:val="both"/>
             </w:pPr>
             <w:r>
+              <w:rPr>
+                <w:sz w:val="24"/>
+                <w:szCs w:val="24"/>
+              </w:rPr>
               <w:t>Most definitions are accurate, with only one or two needing more clarity or detail.</w:t>
             </w:r>
           </w:p>
         </w:tc>
         <w:tc>
           <w:tcPr>
-            <w:tcW w:w="1949" w:type="dxa"/>
+            <w:tcW w:w="2268" w:type="dxa"/>
             <w:tcMar>
               <w:top w:w="100" w:type="dxa"/>
               <w:left w:w="100" w:type="dxa"/>
@@ -510,13 +751,17 @@
               <w:jc w:val="both"/>
             </w:pPr>
             <w:r>
+              <w:rPr>
+                <w:sz w:val="24"/>
+                <w:szCs w:val="24"/>
+              </w:rPr>
               <w:t>Some definitions are too short, unclear, not well selected, or partly incorrect.</w:t>
             </w:r>
           </w:p>
         </w:tc>
         <w:tc>
           <w:tcPr>
-            <w:tcW w:w="3072" w:type="dxa"/>
+            <w:tcW w:w="2693" w:type="dxa"/>
             <w:tcMar>
               <w:top w:w="100" w:type="dxa"/>
               <w:left w:w="100" w:type="dxa"/>
@@ -531,6 +776,10 @@
               <w:jc w:val="both"/>
             </w:pPr>
             <w:r>
+              <w:rPr>
+                <w:sz w:val="24"/>
+                <w:szCs w:val="24"/>
+              </w:rPr>
               <w:t>Definitions are mostly missing, incorrect, or do not match the words.</w:t>
             </w:r>
           </w:p>
@@ -538,32 +787,36 @@
       </w:tr>
       <w:tr>
         <w:trPr>
+          <w:gridAfter w:val="1"/>
+          <w:wAfter w:w="13" w:type="dxa"/>
           <w:trHeight w:val="1460"/>
           <w:jc w:val="center"/>
         </w:trPr>
         <w:tc>
           <w:tcPr>
-            <w:tcW w:w="1516" w:type="dxa"/>
-            <w:tcMar>
-              <w:top w:w="100" w:type="dxa"/>
-              <w:left w:w="100" w:type="dxa"/>
-              <w:bottom w:w="100" w:type="dxa"/>
-              <w:right w:w="100" w:type="dxa"/>
-            </w:tcMar>
-            <w:vAlign w:val="center"/>
-          </w:tcPr>
-          <w:p>
-            <w:pPr>
-              <w:spacing w:line="240" w:lineRule="auto"/>
-              <w:rPr>
-                <w:b/>
-                <w:bCs/>
-              </w:rPr>
-            </w:pPr>
-            <w:r>
-              <w:rPr>
-                <w:b/>
-                <w:bCs/>
+            <w:tcW w:w="1550" w:type="dxa"/>
+            <w:tcMar>
+              <w:top w:w="100" w:type="dxa"/>
+              <w:left w:w="100" w:type="dxa"/>
+              <w:bottom w:w="100" w:type="dxa"/>
+              <w:right w:w="100" w:type="dxa"/>
+            </w:tcMar>
+            <w:vAlign w:val="center"/>
+          </w:tcPr>
+          <w:p>
+            <w:pPr>
+              <w:spacing w:line="240" w:lineRule="auto"/>
+              <w:rPr>
+                <w:b/>
+                <w:bCs/>
+              </w:rPr>
+            </w:pPr>
+            <w:r>
+              <w:rPr>
+                <w:b/>
+                <w:bCs/>
+                <w:sz w:val="24"/>
+                <w:szCs w:val="24"/>
               </w:rPr>
               <w:t>Images</w:t>
             </w:r>
@@ -571,7 +824,7 @@
         </w:tc>
         <w:tc>
           <w:tcPr>
-            <w:tcW w:w="2888" w:type="dxa"/>
+            <w:tcW w:w="2583" w:type="dxa"/>
             <w:tcMar>
               <w:top w:w="100" w:type="dxa"/>
               <w:left w:w="100" w:type="dxa"/>
@@ -586,13 +839,17 @@
               <w:jc w:val="both"/>
             </w:pPr>
             <w:r>
+              <w:rPr>
+                <w:sz w:val="24"/>
+                <w:szCs w:val="24"/>
+              </w:rPr>
               <w:t>Each completed word has a relevant saved image that helps explain the word.</w:t>
             </w:r>
           </w:p>
         </w:tc>
         <w:tc>
           <w:tcPr>
-            <w:tcW w:w="1949" w:type="dxa"/>
+            <w:tcW w:w="2236" w:type="dxa"/>
             <w:tcMar>
               <w:top w:w="100" w:type="dxa"/>
               <w:left w:w="100" w:type="dxa"/>
@@ -607,13 +864,17 @@
               <w:jc w:val="both"/>
             </w:pPr>
             <w:r>
+              <w:rPr>
+                <w:sz w:val="24"/>
+                <w:szCs w:val="24"/>
+              </w:rPr>
               <w:t>Most words have relevant images, with only one or two weak or missing images.</w:t>
             </w:r>
           </w:p>
         </w:tc>
         <w:tc>
           <w:tcPr>
-            <w:tcW w:w="1949" w:type="dxa"/>
+            <w:tcW w:w="2268" w:type="dxa"/>
             <w:tcMar>
               <w:top w:w="100" w:type="dxa"/>
               <w:left w:w="100" w:type="dxa"/>
@@ -628,13 +889,17 @@
               <w:jc w:val="both"/>
             </w:pPr>
             <w:r>
+              <w:rPr>
+                <w:sz w:val="24"/>
+                <w:szCs w:val="24"/>
+              </w:rPr>
               <w:t>Some images are missing, unclear, or only loosely connected to the words.</w:t>
             </w:r>
           </w:p>
         </w:tc>
         <w:tc>
           <w:tcPr>
-            <w:tcW w:w="3072" w:type="dxa"/>
+            <w:tcW w:w="2693" w:type="dxa"/>
             <w:tcMar>
               <w:top w:w="100" w:type="dxa"/>
               <w:left w:w="100" w:type="dxa"/>
@@ -649,6 +914,10 @@
               <w:jc w:val="both"/>
             </w:pPr>
             <w:r>
+              <w:rPr>
+                <w:sz w:val="24"/>
+                <w:szCs w:val="24"/>
+              </w:rPr>
               <w:t>Images are mostly missing, unrelated, or do not help show understanding.</w:t>
             </w:r>
           </w:p>
@@ -656,32 +925,36 @@
       </w:tr>
       <w:tr>
         <w:trPr>
+          <w:gridAfter w:val="1"/>
+          <w:wAfter w:w="13" w:type="dxa"/>
           <w:trHeight w:val="1466"/>
           <w:jc w:val="center"/>
         </w:trPr>
         <w:tc>
           <w:tcPr>
-            <w:tcW w:w="1516" w:type="dxa"/>
-            <w:tcMar>
-              <w:top w:w="100" w:type="dxa"/>
-              <w:left w:w="100" w:type="dxa"/>
-              <w:bottom w:w="100" w:type="dxa"/>
-              <w:right w:w="100" w:type="dxa"/>
-            </w:tcMar>
-            <w:vAlign w:val="center"/>
-          </w:tcPr>
-          <w:p>
-            <w:pPr>
-              <w:spacing w:line="240" w:lineRule="auto"/>
-              <w:rPr>
-                <w:b/>
-                <w:bCs/>
-              </w:rPr>
-            </w:pPr>
-            <w:r>
-              <w:rPr>
-                <w:b/>
-                <w:bCs/>
+            <w:tcW w:w="1550" w:type="dxa"/>
+            <w:tcMar>
+              <w:top w:w="100" w:type="dxa"/>
+              <w:left w:w="100" w:type="dxa"/>
+              <w:bottom w:w="100" w:type="dxa"/>
+              <w:right w:w="100" w:type="dxa"/>
+            </w:tcMar>
+            <w:vAlign w:val="center"/>
+          </w:tcPr>
+          <w:p>
+            <w:pPr>
+              <w:spacing w:line="240" w:lineRule="auto"/>
+              <w:rPr>
+                <w:b/>
+                <w:bCs/>
+              </w:rPr>
+            </w:pPr>
+            <w:r>
+              <w:rPr>
+                <w:b/>
+                <w:bCs/>
+                <w:sz w:val="24"/>
+                <w:szCs w:val="24"/>
               </w:rPr>
               <w:t>Examples and report</w:t>
             </w:r>
@@ -689,7 +962,7 @@
         </w:tc>
         <w:tc>
           <w:tcPr>
-            <w:tcW w:w="2888" w:type="dxa"/>
+            <w:tcW w:w="2583" w:type="dxa"/>
             <w:tcMar>
               <w:top w:w="100" w:type="dxa"/>
               <w:left w:w="100" w:type="dxa"/>
@@ -704,13 +977,17 @@
               <w:jc w:val="both"/>
             </w:pPr>
             <w:r>
+              <w:rPr>
+                <w:sz w:val="24"/>
+                <w:szCs w:val="24"/>
+              </w:rPr>
               <w:t>Each completed word has two meaningful example sentences, and the Word Hunt report is submitted/readable.</w:t>
             </w:r>
           </w:p>
         </w:tc>
         <w:tc>
           <w:tcPr>
-            <w:tcW w:w="1949" w:type="dxa"/>
+            <w:tcW w:w="2236" w:type="dxa"/>
             <w:tcMar>
               <w:top w:w="100" w:type="dxa"/>
               <w:left w:w="100" w:type="dxa"/>
@@ -725,13 +1002,17 @@
               <w:jc w:val="both"/>
             </w:pPr>
             <w:r>
+              <w:rPr>
+                <w:sz w:val="24"/>
+                <w:szCs w:val="24"/>
+              </w:rPr>
               <w:t>Most words have two useful examples, with only minor wording or submission issues.</w:t>
             </w:r>
           </w:p>
         </w:tc>
         <w:tc>
           <w:tcPr>
-            <w:tcW w:w="1949" w:type="dxa"/>
+            <w:tcW w:w="2268" w:type="dxa"/>
             <w:tcMar>
               <w:top w:w="100" w:type="dxa"/>
               <w:left w:w="100" w:type="dxa"/>
@@ -746,13 +1027,17 @@
               <w:jc w:val="both"/>
             </w:pPr>
             <w:r>
+              <w:rPr>
+                <w:sz w:val="24"/>
+                <w:szCs w:val="24"/>
+              </w:rPr>
               <w:t>Some examples are missing, repeated, too general, or the report is hard to check.</w:t>
             </w:r>
           </w:p>
         </w:tc>
         <w:tc>
           <w:tcPr>
-            <w:tcW w:w="3072" w:type="dxa"/>
+            <w:tcW w:w="2693" w:type="dxa"/>
             <w:tcMar>
               <w:top w:w="100" w:type="dxa"/>
               <w:left w:w="100" w:type="dxa"/>
@@ -767,6 +1052,10 @@
               <w:jc w:val="both"/>
             </w:pPr>
             <w:r>
+              <w:rPr>
+                <w:sz w:val="24"/>
+                <w:szCs w:val="24"/>
+              </w:rPr>
               <w:t>Examples are mostly missing or the Word Hunt report is incomplete/not submitted.</w:t>
             </w:r>
           </w:p>
@@ -774,32 +1063,36 @@
       </w:tr>
       <w:tr>
         <w:trPr>
+          <w:gridAfter w:val="1"/>
+          <w:wAfter w:w="13" w:type="dxa"/>
           <w:trHeight w:val="143"/>
           <w:jc w:val="center"/>
         </w:trPr>
         <w:tc>
           <w:tcPr>
-            <w:tcW w:w="1516" w:type="dxa"/>
-            <w:tcMar>
-              <w:top w:w="100" w:type="dxa"/>
-              <w:left w:w="100" w:type="dxa"/>
-              <w:bottom w:w="100" w:type="dxa"/>
-              <w:right w:w="100" w:type="dxa"/>
-            </w:tcMar>
-            <w:vAlign w:val="center"/>
-          </w:tcPr>
-          <w:p>
-            <w:pPr>
-              <w:spacing w:line="240" w:lineRule="auto"/>
-              <w:rPr>
-                <w:b/>
-                <w:bCs/>
-              </w:rPr>
-            </w:pPr>
-            <w:r>
-              <w:rPr>
-                <w:b/>
-                <w:bCs/>
+            <w:tcW w:w="1550" w:type="dxa"/>
+            <w:tcMar>
+              <w:top w:w="100" w:type="dxa"/>
+              <w:left w:w="100" w:type="dxa"/>
+              <w:bottom w:w="100" w:type="dxa"/>
+              <w:right w:w="100" w:type="dxa"/>
+            </w:tcMar>
+            <w:vAlign w:val="center"/>
+          </w:tcPr>
+          <w:p>
+            <w:pPr>
+              <w:spacing w:line="240" w:lineRule="auto"/>
+              <w:rPr>
+                <w:b/>
+                <w:bCs/>
+              </w:rPr>
+            </w:pPr>
+            <w:r>
+              <w:rPr>
+                <w:b/>
+                <w:bCs/>
+                <w:sz w:val="24"/>
+                <w:szCs w:val="24"/>
               </w:rPr>
               <w:t>Criteria</w:t>
             </w:r>
@@ -807,27 +1100,29 @@
         </w:tc>
         <w:tc>
           <w:tcPr>
-            <w:tcW w:w="2888" w:type="dxa"/>
-            <w:tcMar>
-              <w:top w:w="100" w:type="dxa"/>
-              <w:left w:w="100" w:type="dxa"/>
-              <w:bottom w:w="100" w:type="dxa"/>
-              <w:right w:w="100" w:type="dxa"/>
-            </w:tcMar>
-            <w:vAlign w:val="center"/>
-          </w:tcPr>
-          <w:p>
-            <w:pPr>
-              <w:spacing w:line="240" w:lineRule="auto"/>
-              <w:rPr>
-                <w:b/>
-                <w:bCs/>
-              </w:rPr>
-            </w:pPr>
-            <w:r>
-              <w:rPr>
-                <w:b/>
-                <w:bCs/>
+            <w:tcW w:w="2583" w:type="dxa"/>
+            <w:tcMar>
+              <w:top w:w="100" w:type="dxa"/>
+              <w:left w:w="100" w:type="dxa"/>
+              <w:bottom w:w="100" w:type="dxa"/>
+              <w:right w:w="100" w:type="dxa"/>
+            </w:tcMar>
+            <w:vAlign w:val="center"/>
+          </w:tcPr>
+          <w:p>
+            <w:pPr>
+              <w:spacing w:line="240" w:lineRule="auto"/>
+              <w:rPr>
+                <w:b/>
+                <w:bCs/>
+              </w:rPr>
+            </w:pPr>
+            <w:r>
+              <w:rPr>
+                <w:b/>
+                <w:bCs/>
+                <w:sz w:val="24"/>
+                <w:szCs w:val="24"/>
               </w:rPr>
               <w:t>4</w:t>
             </w:r>
@@ -835,27 +1130,29 @@
         </w:tc>
         <w:tc>
           <w:tcPr>
-            <w:tcW w:w="1949" w:type="dxa"/>
-            <w:tcMar>
-              <w:top w:w="100" w:type="dxa"/>
-              <w:left w:w="100" w:type="dxa"/>
-              <w:bottom w:w="100" w:type="dxa"/>
-              <w:right w:w="100" w:type="dxa"/>
-            </w:tcMar>
-            <w:vAlign w:val="center"/>
-          </w:tcPr>
-          <w:p>
-            <w:pPr>
-              <w:spacing w:line="240" w:lineRule="auto"/>
-              <w:rPr>
-                <w:b/>
-                <w:bCs/>
-              </w:rPr>
-            </w:pPr>
-            <w:r>
-              <w:rPr>
-                <w:b/>
-                <w:bCs/>
+            <w:tcW w:w="2236" w:type="dxa"/>
+            <w:tcMar>
+              <w:top w:w="100" w:type="dxa"/>
+              <w:left w:w="100" w:type="dxa"/>
+              <w:bottom w:w="100" w:type="dxa"/>
+              <w:right w:w="100" w:type="dxa"/>
+            </w:tcMar>
+            <w:vAlign w:val="center"/>
+          </w:tcPr>
+          <w:p>
+            <w:pPr>
+              <w:spacing w:line="240" w:lineRule="auto"/>
+              <w:rPr>
+                <w:b/>
+                <w:bCs/>
+              </w:rPr>
+            </w:pPr>
+            <w:r>
+              <w:rPr>
+                <w:b/>
+                <w:bCs/>
+                <w:sz w:val="24"/>
+                <w:szCs w:val="24"/>
               </w:rPr>
               <w:t>3</w:t>
             </w:r>
@@ -863,27 +1160,29 @@
         </w:tc>
         <w:tc>
           <w:tcPr>
-            <w:tcW w:w="1949" w:type="dxa"/>
-            <w:tcMar>
-              <w:top w:w="100" w:type="dxa"/>
-              <w:left w:w="100" w:type="dxa"/>
-              <w:bottom w:w="100" w:type="dxa"/>
-              <w:right w:w="100" w:type="dxa"/>
-            </w:tcMar>
-            <w:vAlign w:val="center"/>
-          </w:tcPr>
-          <w:p>
-            <w:pPr>
-              <w:spacing w:line="240" w:lineRule="auto"/>
-              <w:rPr>
-                <w:b/>
-                <w:bCs/>
-              </w:rPr>
-            </w:pPr>
-            <w:r>
-              <w:rPr>
-                <w:b/>
-                <w:bCs/>
+            <w:tcW w:w="2268" w:type="dxa"/>
+            <w:tcMar>
+              <w:top w:w="100" w:type="dxa"/>
+              <w:left w:w="100" w:type="dxa"/>
+              <w:bottom w:w="100" w:type="dxa"/>
+              <w:right w:w="100" w:type="dxa"/>
+            </w:tcMar>
+            <w:vAlign w:val="center"/>
+          </w:tcPr>
+          <w:p>
+            <w:pPr>
+              <w:spacing w:line="240" w:lineRule="auto"/>
+              <w:rPr>
+                <w:b/>
+                <w:bCs/>
+              </w:rPr>
+            </w:pPr>
+            <w:r>
+              <w:rPr>
+                <w:b/>
+                <w:bCs/>
+                <w:sz w:val="24"/>
+                <w:szCs w:val="24"/>
               </w:rPr>
               <w:t>2</w:t>
             </w:r>
@@ -891,27 +1190,29 @@
         </w:tc>
         <w:tc>
           <w:tcPr>
-            <w:tcW w:w="3072" w:type="dxa"/>
-            <w:tcMar>
-              <w:top w:w="100" w:type="dxa"/>
-              <w:left w:w="100" w:type="dxa"/>
-              <w:bottom w:w="100" w:type="dxa"/>
-              <w:right w:w="100" w:type="dxa"/>
-            </w:tcMar>
-            <w:vAlign w:val="center"/>
-          </w:tcPr>
-          <w:p>
-            <w:pPr>
-              <w:spacing w:line="240" w:lineRule="auto"/>
-              <w:rPr>
-                <w:b/>
-                <w:bCs/>
-              </w:rPr>
-            </w:pPr>
-            <w:r>
-              <w:rPr>
-                <w:b/>
-                <w:bCs/>
+            <w:tcW w:w="2693" w:type="dxa"/>
+            <w:tcMar>
+              <w:top w:w="100" w:type="dxa"/>
+              <w:left w:w="100" w:type="dxa"/>
+              <w:bottom w:w="100" w:type="dxa"/>
+              <w:right w:w="100" w:type="dxa"/>
+            </w:tcMar>
+            <w:vAlign w:val="center"/>
+          </w:tcPr>
+          <w:p>
+            <w:pPr>
+              <w:spacing w:line="240" w:lineRule="auto"/>
+              <w:rPr>
+                <w:b/>
+                <w:bCs/>
+              </w:rPr>
+            </w:pPr>
+            <w:r>
+              <w:rPr>
+                <w:b/>
+                <w:bCs/>
+                <w:sz w:val="24"/>
+                <w:szCs w:val="24"/>
               </w:rPr>
               <w:t>0</w:t>
             </w:r>
@@ -920,32 +1221,36 @@
       </w:tr>
       <w:tr>
         <w:trPr>
+          <w:gridAfter w:val="1"/>
+          <w:wAfter w:w="13" w:type="dxa"/>
           <w:trHeight w:val="1529"/>
           <w:jc w:val="center"/>
         </w:trPr>
         <w:tc>
           <w:tcPr>
-            <w:tcW w:w="1516" w:type="dxa"/>
-            <w:tcMar>
-              <w:top w:w="100" w:type="dxa"/>
-              <w:left w:w="100" w:type="dxa"/>
-              <w:bottom w:w="100" w:type="dxa"/>
-              <w:right w:w="100" w:type="dxa"/>
-            </w:tcMar>
-            <w:vAlign w:val="center"/>
-          </w:tcPr>
-          <w:p>
-            <w:pPr>
-              <w:spacing w:line="240" w:lineRule="auto"/>
-              <w:rPr>
-                <w:b/>
-                <w:bCs/>
-              </w:rPr>
-            </w:pPr>
-            <w:r>
-              <w:rPr>
-                <w:b/>
-                <w:bCs/>
+            <w:tcW w:w="1550" w:type="dxa"/>
+            <w:tcMar>
+              <w:top w:w="100" w:type="dxa"/>
+              <w:left w:w="100" w:type="dxa"/>
+              <w:bottom w:w="100" w:type="dxa"/>
+              <w:right w:w="100" w:type="dxa"/>
+            </w:tcMar>
+            <w:vAlign w:val="center"/>
+          </w:tcPr>
+          <w:p>
+            <w:pPr>
+              <w:spacing w:line="240" w:lineRule="auto"/>
+              <w:rPr>
+                <w:b/>
+                <w:bCs/>
+              </w:rPr>
+            </w:pPr>
+            <w:r>
+              <w:rPr>
+                <w:b/>
+                <w:bCs/>
+                <w:sz w:val="24"/>
+                <w:szCs w:val="24"/>
               </w:rPr>
               <w:t>Punctuality,</w:t>
             </w:r>
@@ -953,6 +1258,8 @@
               <w:rPr>
                 <w:b/>
                 <w:bCs/>
+                <w:sz w:val="24"/>
+                <w:szCs w:val="24"/>
               </w:rPr>
               <w:br/>
               <w:t>Readiness &amp; Respect</w:t>
@@ -961,7 +1268,7 @@
         </w:tc>
         <w:tc>
           <w:tcPr>
-            <w:tcW w:w="2888" w:type="dxa"/>
+            <w:tcW w:w="2583" w:type="dxa"/>
             <w:tcMar>
               <w:top w:w="100" w:type="dxa"/>
               <w:left w:w="100" w:type="dxa"/>
@@ -976,13 +1283,17 @@
               <w:jc w:val="both"/>
             </w:pPr>
             <w:r>
+              <w:rPr>
+                <w:sz w:val="24"/>
+                <w:szCs w:val="24"/>
+              </w:rPr>
               <w:t>Files were delivered on time to Google Classroom, the student was prepared to work, and had necessary resources, e.g. computer, charger, email, and password.</w:t>
             </w:r>
           </w:p>
         </w:tc>
         <w:tc>
           <w:tcPr>
-            <w:tcW w:w="1949" w:type="dxa"/>
+            <w:tcW w:w="2236" w:type="dxa"/>
             <w:tcMar>
               <w:top w:w="100" w:type="dxa"/>
               <w:left w:w="100" w:type="dxa"/>
@@ -997,13 +1308,17 @@
               <w:jc w:val="both"/>
             </w:pPr>
             <w:r>
+              <w:rPr>
+                <w:sz w:val="24"/>
+                <w:szCs w:val="24"/>
+              </w:rPr>
               <w:t>Files were delivered on time, with only one minor readiness or resource issue.</w:t>
             </w:r>
           </w:p>
         </w:tc>
         <w:tc>
           <w:tcPr>
-            <w:tcW w:w="1949" w:type="dxa"/>
+            <w:tcW w:w="2268" w:type="dxa"/>
             <w:tcMar>
               <w:top w:w="100" w:type="dxa"/>
               <w:left w:w="100" w:type="dxa"/>
@@ -1018,13 +1333,17 @@
               <w:jc w:val="both"/>
             </w:pPr>
             <w:r>
+              <w:rPr>
+                <w:sz w:val="24"/>
+                <w:szCs w:val="24"/>
+              </w:rPr>
               <w:t>Files were submitted, but there was a noticeable lateness, readiness, or resource problem.</w:t>
             </w:r>
           </w:p>
         </w:tc>
         <w:tc>
           <w:tcPr>
-            <w:tcW w:w="3072" w:type="dxa"/>
+            <w:tcW w:w="2693" w:type="dxa"/>
             <w:tcMar>
               <w:top w:w="100" w:type="dxa"/>
               <w:left w:w="100" w:type="dxa"/>
@@ -1039,6 +1358,10 @@
               <w:jc w:val="both"/>
             </w:pPr>
             <w:r>
+              <w:rPr>
+                <w:sz w:val="24"/>
+                <w:szCs w:val="24"/>
+              </w:rPr>
               <w:t>Files were not delivered on time to Google Classroom, the student was not prepared to work, or did not have the necessary resources, e.g. computer, charger, email, and password.</w:t>
             </w:r>
           </w:p>
@@ -1046,12 +1369,14 @@
       </w:tr>
       <w:tr>
         <w:trPr>
+          <w:gridAfter w:val="1"/>
+          <w:wAfter w:w="13" w:type="dxa"/>
           <w:trHeight w:val="517"/>
           <w:jc w:val="center"/>
         </w:trPr>
         <w:tc>
           <w:tcPr>
-            <w:tcW w:w="11377" w:type="dxa"/>
+            <w:tcW w:w="11330" w:type="dxa"/>
             <w:gridSpan w:val="5"/>
             <w:tcMar>
               <w:top w:w="100" w:type="dxa"/>
@@ -1069,35 +1394,19 @@
               <w:rPr>
                 <w:b/>
                 <w:bCs/>
+                <w:sz w:val="24"/>
+                <w:szCs w:val="24"/>
               </w:rPr>
               <w:t>Comments</w:t>
             </w:r>
             <w:r>
+              <w:rPr>
+                <w:b/>
+                <w:sz w:val="24"/>
+                <w:szCs w:val="24"/>
+              </w:rPr>
               <w:t>:</w:t>
             </w:r>
-            <w:r>
-              <w:br/>
-            </w:r>
-          </w:p>
-          <w:p>
-            <w:pPr>
-              <w:spacing w:line="240" w:lineRule="auto"/>
-            </w:pPr>
-          </w:p>
-          <w:p>
-            <w:pPr>
-              <w:spacing w:line="240" w:lineRule="auto"/>
-            </w:pPr>
-          </w:p>
-          <w:p>
-            <w:pPr>
-              <w:spacing w:line="240" w:lineRule="auto"/>
-            </w:pPr>
-          </w:p>
-          <w:p>
-            <w:pPr>
-              <w:spacing w:line="240" w:lineRule="auto"/>
-            </w:pPr>
           </w:p>
         </w:tc>
       </w:tr>
@@ -1120,7 +1429,7 @@
     <w:sectPr>
       <w:type w:val="continuous"/>
       <w:pgSz w:w="12240" w:h="15840"/>
-      <w:pgMar w:top="1080" w:right="648" w:bottom="648" w:left="648" w:header="0" w:footer="720" w:gutter="0"/>
+      <w:pgMar w:top="1187" w:right="1865" w:bottom="674" w:left="2090" w:header="0" w:footer="720" w:gutter="0"/>
       <w:pgNumType w:start="1"/>
       <w:cols w:num="2" w:space="720" w:equalWidth="0">
         <w:col w:w="7000" w:space="0"/>
@@ -1778,20 +2087,6 @@
       <w:szCs w:val="48"/>
     </w:rPr>
   </w:style>
-  <w:style w:type="table" w:customStyle="1" w:styleId="a">
-    <w:basedOn w:val="TableNormal0"/>
-    <w:tblPr>
-      <w:tblStyleRowBandSize w:val="1"/>
-      <w:tblStyleColBandSize w:val="1"/>
-    </w:tblPr>
-  </w:style>
-  <w:style w:type="table" w:customStyle="1" w:styleId="a0">
-    <w:basedOn w:val="TableNormal0"/>
-    <w:tblPr>
-      <w:tblStyleRowBandSize w:val="1"/>
-      <w:tblStyleColBandSize w:val="1"/>
-    </w:tblPr>
-  </w:style>
   <w:style w:type="character" w:styleId="Strong">
     <w:name w:val="Strong"/>
     <w:basedOn w:val="DefaultParagraphFont"/>

</xml_diff>